<commit_message>
Them bth th tuan 04
</commit_message>
<xml_diff>
--- a/TH_Tuan04/22658701_LeTranGiaHuy_TH_Docker.docx
+++ b/TH_Tuan04/22658701_LeTranGiaHuy_TH_Docker.docx
@@ -134,12 +134,12 @@
                 <wp:inline distB="114300" distT="114300" distL="114300" distR="114300">
                   <wp:extent cx="5153025" cy="2895600"/>
                   <wp:effectExtent b="0" l="0" r="0" t="0"/>
-                  <wp:docPr id="2" name="image21.png"/>
+                  <wp:docPr id="2" name="image4.png"/>
                   <a:graphic>
                     <a:graphicData uri="http://schemas.openxmlformats.org/drawingml/2006/picture">
                       <pic:pic>
                         <pic:nvPicPr>
-                          <pic:cNvPr id="0" name="image21.png"/>
+                          <pic:cNvPr id="0" name="image4.png"/>
                           <pic:cNvPicPr preferRelativeResize="0"/>
                         </pic:nvPicPr>
                         <pic:blipFill>
@@ -267,12 +267,12 @@
                 <wp:inline distB="114300" distT="114300" distL="114300" distR="114300">
                   <wp:extent cx="5153025" cy="2895600"/>
                   <wp:effectExtent b="0" l="0" r="0" t="0"/>
-                  <wp:docPr id="3" name="image15.png"/>
+                  <wp:docPr id="3" name="image5.png"/>
                   <a:graphic>
                     <a:graphicData uri="http://schemas.openxmlformats.org/drawingml/2006/picture">
                       <pic:pic>
                         <pic:nvPicPr>
-                          <pic:cNvPr id="0" name="image15.png"/>
+                          <pic:cNvPr id="0" name="image5.png"/>
                           <pic:cNvPicPr preferRelativeResize="0"/>
                         </pic:nvPicPr>
                         <pic:blipFill>
@@ -400,12 +400,12 @@
                 <wp:inline distB="114300" distT="114300" distL="114300" distR="114300">
                   <wp:extent cx="5153025" cy="2692400"/>
                   <wp:effectExtent b="0" l="0" r="0" t="0"/>
-                  <wp:docPr id="27" name="image24.png"/>
+                  <wp:docPr id="37" name="image28.png"/>
                   <a:graphic>
                     <a:graphicData uri="http://schemas.openxmlformats.org/drawingml/2006/picture">
                       <pic:pic>
                         <pic:nvPicPr>
-                          <pic:cNvPr id="0" name="image24.png"/>
+                          <pic:cNvPr id="0" name="image28.png"/>
                           <pic:cNvPicPr preferRelativeResize="0"/>
                         </pic:nvPicPr>
                         <pic:blipFill>
@@ -561,12 +561,12 @@
                 <wp:inline distB="114300" distT="114300" distL="114300" distR="114300">
                   <wp:extent cx="5153025" cy="2895600"/>
                   <wp:effectExtent b="0" l="0" r="0" t="0"/>
-                  <wp:docPr id="12" name="image14.png"/>
+                  <wp:docPr id="15" name="image36.png"/>
                   <a:graphic>
                     <a:graphicData uri="http://schemas.openxmlformats.org/drawingml/2006/picture">
                       <pic:pic>
                         <pic:nvPicPr>
-                          <pic:cNvPr id="0" name="image14.png"/>
+                          <pic:cNvPr id="0" name="image36.png"/>
                           <pic:cNvPicPr preferRelativeResize="0"/>
                         </pic:nvPicPr>
                         <pic:blipFill>
@@ -722,12 +722,12 @@
                 <wp:inline distB="114300" distT="114300" distL="114300" distR="114300">
                   <wp:extent cx="5153025" cy="2070100"/>
                   <wp:effectExtent b="0" l="0" r="0" t="0"/>
-                  <wp:docPr id="6" name="image18.png"/>
+                  <wp:docPr id="9" name="image6.png"/>
                   <a:graphic>
                     <a:graphicData uri="http://schemas.openxmlformats.org/drawingml/2006/picture">
                       <pic:pic>
                         <pic:nvPicPr>
-                          <pic:cNvPr id="0" name="image18.png"/>
+                          <pic:cNvPr id="0" name="image6.png"/>
                           <pic:cNvPicPr preferRelativeResize="0"/>
                         </pic:nvPicPr>
                         <pic:blipFill>
@@ -897,12 +897,12 @@
                 <wp:inline distB="114300" distT="114300" distL="114300" distR="114300">
                   <wp:extent cx="5153025" cy="2070100"/>
                   <wp:effectExtent b="0" l="0" r="0" t="0"/>
-                  <wp:docPr id="29" name="image17.png"/>
+                  <wp:docPr id="39" name="image23.png"/>
                   <a:graphic>
                     <a:graphicData uri="http://schemas.openxmlformats.org/drawingml/2006/picture">
                       <pic:pic>
                         <pic:nvPicPr>
-                          <pic:cNvPr id="0" name="image17.png"/>
+                          <pic:cNvPr id="0" name="image23.png"/>
                           <pic:cNvPicPr preferRelativeResize="0"/>
                         </pic:nvPicPr>
                         <pic:blipFill>
@@ -1058,12 +1058,12 @@
                 <wp:inline distB="114300" distT="114300" distL="114300" distR="114300">
                   <wp:extent cx="5153025" cy="2349500"/>
                   <wp:effectExtent b="0" l="0" r="0" t="0"/>
-                  <wp:docPr id="15" name="image8.png"/>
+                  <wp:docPr id="19" name="image26.png"/>
                   <a:graphic>
                     <a:graphicData uri="http://schemas.openxmlformats.org/drawingml/2006/picture">
                       <pic:pic>
                         <pic:nvPicPr>
-                          <pic:cNvPr id="0" name="image8.png"/>
+                          <pic:cNvPr id="0" name="image26.png"/>
                           <pic:cNvPicPr preferRelativeResize="0"/>
                         </pic:nvPicPr>
                         <pic:blipFill>
@@ -1205,12 +1205,12 @@
                 <wp:inline distB="114300" distT="114300" distL="114300" distR="114300">
                   <wp:extent cx="5153025" cy="2654300"/>
                   <wp:effectExtent b="0" l="0" r="0" t="0"/>
-                  <wp:docPr id="21" name="image22.png"/>
+                  <wp:docPr id="28" name="image25.png"/>
                   <a:graphic>
                     <a:graphicData uri="http://schemas.openxmlformats.org/drawingml/2006/picture">
                       <pic:pic>
                         <pic:nvPicPr>
-                          <pic:cNvPr id="0" name="image22.png"/>
+                          <pic:cNvPr id="0" name="image25.png"/>
                           <pic:cNvPicPr preferRelativeResize="0"/>
                         </pic:nvPicPr>
                         <pic:blipFill>
@@ -1366,12 +1366,12 @@
                 <wp:inline distB="114300" distT="114300" distL="114300" distR="114300">
                   <wp:extent cx="5153025" cy="2857500"/>
                   <wp:effectExtent b="0" l="0" r="0" t="0"/>
-                  <wp:docPr id="24" name="image29.png"/>
+                  <wp:docPr id="33" name="image35.png"/>
                   <a:graphic>
                     <a:graphicData uri="http://schemas.openxmlformats.org/drawingml/2006/picture">
                       <pic:pic>
                         <pic:nvPicPr>
-                          <pic:cNvPr id="0" name="image29.png"/>
+                          <pic:cNvPr id="0" name="image35.png"/>
                           <pic:cNvPicPr preferRelativeResize="0"/>
                         </pic:nvPicPr>
                         <pic:blipFill>
@@ -1527,12 +1527,12 @@
                 <wp:inline distB="114300" distT="114300" distL="114300" distR="114300">
                   <wp:extent cx="5153025" cy="3378200"/>
                   <wp:effectExtent b="0" l="0" r="0" t="0"/>
-                  <wp:docPr id="10" name="image16.png"/>
+                  <wp:docPr id="13" name="image3.png"/>
                   <a:graphic>
                     <a:graphicData uri="http://schemas.openxmlformats.org/drawingml/2006/picture">
                       <pic:pic>
                         <pic:nvPicPr>
-                          <pic:cNvPr id="0" name="image16.png"/>
+                          <pic:cNvPr id="0" name="image3.png"/>
                           <pic:cNvPicPr preferRelativeResize="0"/>
                         </pic:nvPicPr>
                         <pic:blipFill>
@@ -1688,12 +1688,12 @@
                 <wp:inline distB="114300" distT="114300" distL="114300" distR="114300">
                   <wp:extent cx="5153025" cy="3124200"/>
                   <wp:effectExtent b="0" l="0" r="0" t="0"/>
-                  <wp:docPr id="23" name="image28.png"/>
+                  <wp:docPr id="32" name="image38.png"/>
                   <a:graphic>
                     <a:graphicData uri="http://schemas.openxmlformats.org/drawingml/2006/picture">
                       <pic:pic>
                         <pic:nvPicPr>
-                          <pic:cNvPr id="0" name="image28.png"/>
+                          <pic:cNvPr id="0" name="image38.png"/>
                           <pic:cNvPicPr preferRelativeResize="0"/>
                         </pic:nvPicPr>
                         <pic:blipFill>
@@ -1849,12 +1849,12 @@
                 <wp:inline distB="114300" distT="114300" distL="114300" distR="114300">
                   <wp:extent cx="5153025" cy="1384300"/>
                   <wp:effectExtent b="0" l="0" r="0" t="0"/>
-                  <wp:docPr id="8" name="image12.png"/>
+                  <wp:docPr id="11" name="image24.png"/>
                   <a:graphic>
                     <a:graphicData uri="http://schemas.openxmlformats.org/drawingml/2006/picture">
                       <pic:pic>
                         <pic:nvPicPr>
-                          <pic:cNvPr id="0" name="image12.png"/>
+                          <pic:cNvPr id="0" name="image24.png"/>
                           <pic:cNvPicPr preferRelativeResize="0"/>
                         </pic:nvPicPr>
                         <pic:blipFill>
@@ -2024,12 +2024,12 @@
                 <wp:inline distB="114300" distT="114300" distL="114300" distR="114300">
                   <wp:extent cx="5153025" cy="3009900"/>
                   <wp:effectExtent b="0" l="0" r="0" t="0"/>
-                  <wp:docPr id="5" name="image4.png"/>
+                  <wp:docPr id="8" name="image33.png"/>
                   <a:graphic>
                     <a:graphicData uri="http://schemas.openxmlformats.org/drawingml/2006/picture">
                       <pic:pic>
                         <pic:nvPicPr>
-                          <pic:cNvPr id="0" name="image4.png"/>
+                          <pic:cNvPr id="0" name="image33.png"/>
                           <pic:cNvPicPr preferRelativeResize="0"/>
                         </pic:nvPicPr>
                         <pic:blipFill>
@@ -2185,12 +2185,12 @@
                 <wp:inline distB="114300" distT="114300" distL="114300" distR="114300">
                   <wp:extent cx="5153025" cy="1676400"/>
                   <wp:effectExtent b="0" l="0" r="0" t="0"/>
-                  <wp:docPr id="26" name="image27.png"/>
+                  <wp:docPr id="35" name="image19.png"/>
                   <a:graphic>
                     <a:graphicData uri="http://schemas.openxmlformats.org/drawingml/2006/picture">
                       <pic:pic>
                         <pic:nvPicPr>
-                          <pic:cNvPr id="0" name="image27.png"/>
+                          <pic:cNvPr id="0" name="image19.png"/>
                           <pic:cNvPicPr preferRelativeResize="0"/>
                         </pic:nvPicPr>
                         <pic:blipFill>
@@ -2346,12 +2346,12 @@
                 <wp:inline distB="114300" distT="114300" distL="114300" distR="114300">
                   <wp:extent cx="5153025" cy="4508500"/>
                   <wp:effectExtent b="0" l="0" r="0" t="0"/>
-                  <wp:docPr id="14" name="image11.png"/>
+                  <wp:docPr id="18" name="image13.png"/>
                   <a:graphic>
                     <a:graphicData uri="http://schemas.openxmlformats.org/drawingml/2006/picture">
                       <pic:pic>
                         <pic:nvPicPr>
-                          <pic:cNvPr id="0" name="image11.png"/>
+                          <pic:cNvPr id="0" name="image13.png"/>
                           <pic:cNvPicPr preferRelativeResize="0"/>
                         </pic:nvPicPr>
                         <pic:blipFill>
@@ -2507,12 +2507,12 @@
                 <wp:inline distB="114300" distT="114300" distL="114300" distR="114300">
                   <wp:extent cx="5153025" cy="3365500"/>
                   <wp:effectExtent b="0" l="0" r="0" t="0"/>
-                  <wp:docPr id="1" name="image6.png"/>
+                  <wp:docPr id="1" name="image9.png"/>
                   <a:graphic>
                     <a:graphicData uri="http://schemas.openxmlformats.org/drawingml/2006/picture">
                       <pic:pic>
                         <pic:nvPicPr>
-                          <pic:cNvPr id="0" name="image6.png"/>
+                          <pic:cNvPr id="0" name="image9.png"/>
                           <pic:cNvPicPr preferRelativeResize="0"/>
                         </pic:nvPicPr>
                         <pic:blipFill>
@@ -2668,12 +2668,12 @@
                 <wp:inline distB="114300" distT="114300" distL="114300" distR="114300">
                   <wp:extent cx="5153025" cy="2895600"/>
                   <wp:effectExtent b="0" l="0" r="0" t="0"/>
-                  <wp:docPr id="18" name="image19.png"/>
+                  <wp:docPr id="23" name="image29.png"/>
                   <a:graphic>
                     <a:graphicData uri="http://schemas.openxmlformats.org/drawingml/2006/picture">
                       <pic:pic>
                         <pic:nvPicPr>
-                          <pic:cNvPr id="0" name="image19.png"/>
+                          <pic:cNvPr id="0" name="image29.png"/>
                           <pic:cNvPicPr preferRelativeResize="0"/>
                         </pic:nvPicPr>
                         <pic:blipFill>
@@ -2734,12 +2734,12 @@
                 <wp:inline distB="114300" distT="114300" distL="114300" distR="114300">
                   <wp:extent cx="5153025" cy="2895600"/>
                   <wp:effectExtent b="0" l="0" r="0" t="0"/>
-                  <wp:docPr id="13" name="image5.png"/>
+                  <wp:docPr id="17" name="image12.png"/>
                   <a:graphic>
                     <a:graphicData uri="http://schemas.openxmlformats.org/drawingml/2006/picture">
                       <pic:pic>
                         <pic:nvPicPr>
-                          <pic:cNvPr id="0" name="image5.png"/>
+                          <pic:cNvPr id="0" name="image12.png"/>
                           <pic:cNvPicPr preferRelativeResize="0"/>
                         </pic:nvPicPr>
                         <pic:blipFill>
@@ -2895,12 +2895,12 @@
                 <wp:inline distB="114300" distT="114300" distL="114300" distR="114300">
                   <wp:extent cx="5153025" cy="2692400"/>
                   <wp:effectExtent b="0" l="0" r="0" t="0"/>
-                  <wp:docPr id="20" name="image3.png"/>
+                  <wp:docPr id="26" name="image14.png"/>
                   <a:graphic>
                     <a:graphicData uri="http://schemas.openxmlformats.org/drawingml/2006/picture">
                       <pic:pic>
                         <pic:nvPicPr>
-                          <pic:cNvPr id="0" name="image3.png"/>
+                          <pic:cNvPr id="0" name="image14.png"/>
                           <pic:cNvPicPr preferRelativeResize="0"/>
                         </pic:nvPicPr>
                         <pic:blipFill>
@@ -3070,12 +3070,12 @@
                 <wp:inline distB="114300" distT="114300" distL="114300" distR="114300">
                   <wp:extent cx="5153025" cy="3009900"/>
                   <wp:effectExtent b="0" l="0" r="0" t="0"/>
-                  <wp:docPr id="9" name="image9.png"/>
+                  <wp:docPr id="12" name="image27.png"/>
                   <a:graphic>
                     <a:graphicData uri="http://schemas.openxmlformats.org/drawingml/2006/picture">
                       <pic:pic>
                         <pic:nvPicPr>
-                          <pic:cNvPr id="0" name="image9.png"/>
+                          <pic:cNvPr id="0" name="image27.png"/>
                           <pic:cNvPicPr preferRelativeResize="0"/>
                         </pic:nvPicPr>
                         <pic:blipFill>
@@ -3231,12 +3231,12 @@
                 <wp:inline distB="114300" distT="114300" distL="114300" distR="114300">
                   <wp:extent cx="5153025" cy="2006600"/>
                   <wp:effectExtent b="0" l="0" r="0" t="0"/>
-                  <wp:docPr id="28" name="image26.png"/>
+                  <wp:docPr id="38" name="image21.png"/>
                   <a:graphic>
                     <a:graphicData uri="http://schemas.openxmlformats.org/drawingml/2006/picture">
                       <pic:pic>
                         <pic:nvPicPr>
-                          <pic:cNvPr id="0" name="image26.png"/>
+                          <pic:cNvPr id="0" name="image21.png"/>
                           <pic:cNvPicPr preferRelativeResize="0"/>
                         </pic:nvPicPr>
                         <pic:blipFill>
@@ -3406,12 +3406,12 @@
                 <wp:inline distB="114300" distT="114300" distL="114300" distR="114300">
                   <wp:extent cx="5153025" cy="1727200"/>
                   <wp:effectExtent b="0" l="0" r="0" t="0"/>
-                  <wp:docPr id="22" name="image25.png"/>
+                  <wp:docPr id="29" name="image17.png"/>
                   <a:graphic>
                     <a:graphicData uri="http://schemas.openxmlformats.org/drawingml/2006/picture">
                       <pic:pic>
                         <pic:nvPicPr>
-                          <pic:cNvPr id="0" name="image25.png"/>
+                          <pic:cNvPr id="0" name="image17.png"/>
                           <pic:cNvPicPr preferRelativeResize="0"/>
                         </pic:nvPicPr>
                         <pic:blipFill>
@@ -3567,12 +3567,12 @@
                 <wp:inline distB="114300" distT="114300" distL="114300" distR="114300">
                   <wp:extent cx="5153025" cy="1968500"/>
                   <wp:effectExtent b="0" l="0" r="0" t="0"/>
-                  <wp:docPr id="25" name="image23.png"/>
+                  <wp:docPr id="34" name="image18.png"/>
                   <a:graphic>
                     <a:graphicData uri="http://schemas.openxmlformats.org/drawingml/2006/picture">
                       <pic:pic>
                         <pic:nvPicPr>
-                          <pic:cNvPr id="0" name="image23.png"/>
+                          <pic:cNvPr id="0" name="image18.png"/>
                           <pic:cNvPicPr preferRelativeResize="0"/>
                         </pic:nvPicPr>
                         <pic:blipFill>
@@ -3728,12 +3728,12 @@
                 <wp:inline distB="114300" distT="114300" distL="114300" distR="114300">
                   <wp:extent cx="5153025" cy="2400300"/>
                   <wp:effectExtent b="0" l="0" r="0" t="0"/>
-                  <wp:docPr id="7" name="image20.png"/>
+                  <wp:docPr id="10" name="image34.png"/>
                   <a:graphic>
                     <a:graphicData uri="http://schemas.openxmlformats.org/drawingml/2006/picture">
                       <pic:pic>
                         <pic:nvPicPr>
-                          <pic:cNvPr id="0" name="image20.png"/>
+                          <pic:cNvPr id="0" name="image34.png"/>
                           <pic:cNvPicPr preferRelativeResize="0"/>
                         </pic:nvPicPr>
                         <pic:blipFill>
@@ -3889,7 +3889,7 @@
                 <wp:inline distB="114300" distT="114300" distL="114300" distR="114300">
                   <wp:extent cx="5153025" cy="1016000"/>
                   <wp:effectExtent b="0" l="0" r="0" t="0"/>
-                  <wp:docPr id="4" name="image1.png"/>
+                  <wp:docPr id="6" name="image1.png"/>
                   <a:graphic>
                     <a:graphicData uri="http://schemas.openxmlformats.org/drawingml/2006/picture">
                       <pic:pic>
@@ -4050,12 +4050,12 @@
                 <wp:inline distB="114300" distT="114300" distL="114300" distR="114300">
                   <wp:extent cx="5153025" cy="1270000"/>
                   <wp:effectExtent b="0" l="0" r="0" t="0"/>
-                  <wp:docPr id="17" name="image2.png"/>
+                  <wp:docPr id="21" name="image31.png"/>
                   <a:graphic>
                     <a:graphicData uri="http://schemas.openxmlformats.org/drawingml/2006/picture">
                       <pic:pic>
                         <pic:nvPicPr>
-                          <pic:cNvPr id="0" name="image2.png"/>
+                          <pic:cNvPr id="0" name="image31.png"/>
                           <pic:cNvPicPr preferRelativeResize="0"/>
                         </pic:nvPicPr>
                         <pic:blipFill>
@@ -4211,12 +4211,12 @@
                 <wp:inline distB="114300" distT="114300" distL="114300" distR="114300">
                   <wp:extent cx="5153025" cy="1447800"/>
                   <wp:effectExtent b="0" l="0" r="0" t="0"/>
-                  <wp:docPr id="19" name="image7.png"/>
+                  <wp:docPr id="24" name="image32.png"/>
                   <a:graphic>
                     <a:graphicData uri="http://schemas.openxmlformats.org/drawingml/2006/picture">
                       <pic:pic>
                         <pic:nvPicPr>
-                          <pic:cNvPr id="0" name="image7.png"/>
+                          <pic:cNvPr id="0" name="image32.png"/>
                           <pic:cNvPicPr preferRelativeResize="0"/>
                         </pic:nvPicPr>
                         <pic:blipFill>
@@ -4372,12 +4372,12 @@
                 <wp:inline distB="114300" distT="114300" distL="114300" distR="114300">
                   <wp:extent cx="5153025" cy="1282700"/>
                   <wp:effectExtent b="0" l="0" r="0" t="0"/>
-                  <wp:docPr id="11" name="image13.png"/>
+                  <wp:docPr id="14" name="image8.png"/>
                   <a:graphic>
                     <a:graphicData uri="http://schemas.openxmlformats.org/drawingml/2006/picture">
                       <pic:pic>
                         <pic:nvPicPr>
-                          <pic:cNvPr id="0" name="image13.png"/>
+                          <pic:cNvPr id="0" name="image8.png"/>
                           <pic:cNvPicPr preferRelativeResize="0"/>
                         </pic:nvPicPr>
                         <pic:blipFill>
@@ -4533,12 +4533,12 @@
                 <wp:inline distB="114300" distT="114300" distL="114300" distR="114300">
                   <wp:extent cx="5153025" cy="2667000"/>
                   <wp:effectExtent b="0" l="0" r="0" t="0"/>
-                  <wp:docPr id="16" name="image10.png"/>
+                  <wp:docPr id="20" name="image37.png"/>
                   <a:graphic>
                     <a:graphicData uri="http://schemas.openxmlformats.org/drawingml/2006/picture">
                       <pic:pic>
                         <pic:nvPicPr>
-                          <pic:cNvPr id="0" name="image10.png"/>
+                          <pic:cNvPr id="0" name="image37.png"/>
                           <pic:cNvPicPr preferRelativeResize="0"/>
                         </pic:nvPicPr>
                         <pic:blipFill>
@@ -4902,8 +4902,8 @@
             <w:pPr>
               <w:widowControl w:val="0"/>
               <w:rPr>
-                <w:sz w:val="20"/>
-                <w:szCs w:val="20"/>
+                <w:sz w:val="24"/>
+                <w:szCs w:val="24"/>
               </w:rPr>
             </w:pPr>
             <w:r>
@@ -4913,6 +4913,171 @@
                 <w:rtl w:val="0"/>
               </w:rPr>
               <w:t xml:space="preserve">docker run -d -p 8080:80 my_nginx_image</w:t>
+            </w:r>
+          </w:p>
+          <w:p>
+            <w:pPr>
+              <w:widowControl w:val="0"/>
+              <w:rPr>
+                <w:sz w:val="24"/>
+                <w:szCs w:val="24"/>
+              </w:rPr>
+            </w:pPr>
+            <w:r>
+              <w:rPr>
+                <w:sz w:val="24"/>
+                <w:szCs w:val="24"/>
+              </w:rPr>
+              <w:drawing>
+                <wp:inline distB="114300" distT="114300" distL="114300" distR="114300">
+                  <wp:extent cx="5153025" cy="2400300"/>
+                  <wp:effectExtent b="0" l="0" r="0" t="0"/>
+                  <wp:docPr id="27" name="image22.png"/>
+                  <a:graphic>
+                    <a:graphicData uri="http://schemas.openxmlformats.org/drawingml/2006/picture">
+                      <pic:pic>
+                        <pic:nvPicPr>
+                          <pic:cNvPr id="0" name="image22.png"/>
+                          <pic:cNvPicPr preferRelativeResize="0"/>
+                        </pic:nvPicPr>
+                        <pic:blipFill>
+                          <a:blip r:embed="rId34"/>
+                          <a:srcRect b="0" l="0" r="0" t="0"/>
+                          <a:stretch>
+                            <a:fillRect/>
+                          </a:stretch>
+                        </pic:blipFill>
+                        <pic:spPr>
+                          <a:xfrm>
+                            <a:off x="0" y="0"/>
+                            <a:ext cx="5153025" cy="2400300"/>
+                          </a:xfrm>
+                          <a:prstGeom prst="rect"/>
+                          <a:ln/>
+                        </pic:spPr>
+                      </pic:pic>
+                    </a:graphicData>
+                  </a:graphic>
+                </wp:inline>
+              </w:drawing>
+            </w:r>
+            <w:r>
+              <w:rPr>
+                <w:rtl w:val="0"/>
+              </w:rPr>
+            </w:r>
+          </w:p>
+          <w:p>
+            <w:pPr>
+              <w:widowControl w:val="0"/>
+              <w:rPr>
+                <w:sz w:val="24"/>
+                <w:szCs w:val="24"/>
+              </w:rPr>
+            </w:pPr>
+            <w:r>
+              <w:rPr>
+                <w:sz w:val="24"/>
+                <w:szCs w:val="24"/>
+              </w:rPr>
+              <w:drawing>
+                <wp:inline distB="114300" distT="114300" distL="114300" distR="114300">
+                  <wp:extent cx="5153025" cy="2730500"/>
+                  <wp:effectExtent b="0" l="0" r="0" t="0"/>
+                  <wp:docPr id="36" name="image20.png"/>
+                  <a:graphic>
+                    <a:graphicData uri="http://schemas.openxmlformats.org/drawingml/2006/picture">
+                      <pic:pic>
+                        <pic:nvPicPr>
+                          <pic:cNvPr id="0" name="image20.png"/>
+                          <pic:cNvPicPr preferRelativeResize="0"/>
+                        </pic:nvPicPr>
+                        <pic:blipFill>
+                          <a:blip r:embed="rId35"/>
+                          <a:srcRect b="0" l="0" r="0" t="0"/>
+                          <a:stretch>
+                            <a:fillRect/>
+                          </a:stretch>
+                        </pic:blipFill>
+                        <pic:spPr>
+                          <a:xfrm>
+                            <a:off x="0" y="0"/>
+                            <a:ext cx="5153025" cy="2730500"/>
+                          </a:xfrm>
+                          <a:prstGeom prst="rect"/>
+                          <a:ln/>
+                        </pic:spPr>
+                      </pic:pic>
+                    </a:graphicData>
+                  </a:graphic>
+                </wp:inline>
+              </w:drawing>
+            </w:r>
+            <w:r>
+              <w:rPr>
+                <w:rtl w:val="0"/>
+              </w:rPr>
+            </w:r>
+          </w:p>
+          <w:p>
+            <w:pPr>
+              <w:widowControl w:val="0"/>
+              <w:rPr>
+                <w:sz w:val="24"/>
+                <w:szCs w:val="24"/>
+              </w:rPr>
+            </w:pPr>
+            <w:r>
+              <w:rPr>
+                <w:rtl w:val="0"/>
+              </w:rPr>
+            </w:r>
+          </w:p>
+          <w:p>
+            <w:pPr>
+              <w:widowControl w:val="0"/>
+              <w:rPr>
+                <w:sz w:val="24"/>
+                <w:szCs w:val="24"/>
+              </w:rPr>
+            </w:pPr>
+            <w:r>
+              <w:rPr>
+                <w:sz w:val="24"/>
+                <w:szCs w:val="24"/>
+              </w:rPr>
+              <w:drawing>
+                <wp:inline distB="114300" distT="114300" distL="114300" distR="114300">
+                  <wp:extent cx="5153025" cy="2895600"/>
+                  <wp:effectExtent b="0" l="0" r="0" t="0"/>
+                  <wp:docPr id="31" name="image39.png"/>
+                  <a:graphic>
+                    <a:graphicData uri="http://schemas.openxmlformats.org/drawingml/2006/picture">
+                      <pic:pic>
+                        <pic:nvPicPr>
+                          <pic:cNvPr id="0" name="image39.png"/>
+                          <pic:cNvPicPr preferRelativeResize="0"/>
+                        </pic:nvPicPr>
+                        <pic:blipFill>
+                          <a:blip r:embed="rId36"/>
+                          <a:srcRect b="0" l="0" r="0" t="0"/>
+                          <a:stretch>
+                            <a:fillRect/>
+                          </a:stretch>
+                        </pic:blipFill>
+                        <pic:spPr>
+                          <a:xfrm>
+                            <a:off x="0" y="0"/>
+                            <a:ext cx="5153025" cy="2895600"/>
+                          </a:xfrm>
+                          <a:prstGeom prst="rect"/>
+                          <a:ln/>
+                        </pic:spPr>
+                      </pic:pic>
+                    </a:graphicData>
+                  </a:graphic>
+                </wp:inline>
+              </w:drawing>
             </w:r>
             <w:r>
               <w:rPr>
@@ -4923,6 +5088,743 @@
         </w:tc>
       </w:tr>
     </w:tbl>
+    <w:p>
+      <w:pPr>
+        <w:rPr/>
+      </w:pPr>
+      <w:r>
+        <w:rPr>
+          <w:rtl w:val="0"/>
+        </w:rPr>
+      </w:r>
+    </w:p>
+    <w:p>
+      <w:pPr>
+        <w:rPr/>
+      </w:pPr>
+      <w:r>
+        <w:rPr>
+          <w:rtl w:val="0"/>
+        </w:rPr>
+        <w:t xml:space="preserve">Bài 1: Tạo Dockerfile chạy một ứng dụng Node.js đơn giản</w:t>
+      </w:r>
+    </w:p>
+    <w:p>
+      <w:pPr>
+        <w:rPr/>
+      </w:pPr>
+      <w:r>
+        <w:rPr>
+          <w:rtl w:val="0"/>
+        </w:rPr>
+        <w:t xml:space="preserve">Yêu cầu:Viết Dockerfile để chạy một ứng dụng Node.js hiển thị "Hello, Docker!" trên cổng 3000.</w:t>
+      </w:r>
+    </w:p>
+    <w:p>
+      <w:pPr>
+        <w:rPr/>
+      </w:pPr>
+      <w:r>
+        <w:rPr>
+          <w:rtl w:val="0"/>
+        </w:rPr>
+        <w:t xml:space="preserve">Sử dụng node:18 làm base image.</w:t>
+      </w:r>
+    </w:p>
+    <w:p>
+      <w:pPr>
+        <w:rPr/>
+      </w:pPr>
+      <w:r>
+        <w:rPr>
+          <w:rtl w:val="0"/>
+        </w:rPr>
+      </w:r>
+    </w:p>
+    <w:p>
+      <w:pPr>
+        <w:rPr/>
+      </w:pPr>
+      <w:r>
+        <w:rPr/>
+        <w:drawing>
+          <wp:inline distB="114300" distT="114300" distL="114300" distR="114300">
+            <wp:extent cx="5731200" cy="3225800"/>
+            <wp:effectExtent b="0" l="0" r="0" t="0"/>
+            <wp:docPr id="30" name="image30.png"/>
+            <a:graphic>
+              <a:graphicData uri="http://schemas.openxmlformats.org/drawingml/2006/picture">
+                <pic:pic>
+                  <pic:nvPicPr>
+                    <pic:cNvPr id="0" name="image30.png"/>
+                    <pic:cNvPicPr preferRelativeResize="0"/>
+                  </pic:nvPicPr>
+                  <pic:blipFill>
+                    <a:blip r:embed="rId37"/>
+                    <a:srcRect b="0" l="0" r="0" t="0"/>
+                    <a:stretch>
+                      <a:fillRect/>
+                    </a:stretch>
+                  </pic:blipFill>
+                  <pic:spPr>
+                    <a:xfrm>
+                      <a:off x="0" y="0"/>
+                      <a:ext cx="5731200" cy="3225800"/>
+                    </a:xfrm>
+                    <a:prstGeom prst="rect"/>
+                    <a:ln/>
+                  </pic:spPr>
+                </pic:pic>
+              </a:graphicData>
+            </a:graphic>
+          </wp:inline>
+        </w:drawing>
+      </w:r>
+      <w:r>
+        <w:rPr>
+          <w:rtl w:val="0"/>
+        </w:rPr>
+      </w:r>
+    </w:p>
+    <w:p>
+      <w:pPr>
+        <w:rPr/>
+      </w:pPr>
+      <w:r>
+        <w:rPr>
+          <w:rtl w:val="0"/>
+        </w:rPr>
+      </w:r>
+    </w:p>
+    <w:p>
+      <w:pPr>
+        <w:rPr/>
+      </w:pPr>
+      <w:r>
+        <w:rPr/>
+        <w:drawing>
+          <wp:inline distB="114300" distT="114300" distL="114300" distR="114300">
+            <wp:extent cx="5731200" cy="3225800"/>
+            <wp:effectExtent b="0" l="0" r="0" t="0"/>
+            <wp:docPr id="7" name="image10.png"/>
+            <a:graphic>
+              <a:graphicData uri="http://schemas.openxmlformats.org/drawingml/2006/picture">
+                <pic:pic>
+                  <pic:nvPicPr>
+                    <pic:cNvPr id="0" name="image10.png"/>
+                    <pic:cNvPicPr preferRelativeResize="0"/>
+                  </pic:nvPicPr>
+                  <pic:blipFill>
+                    <a:blip r:embed="rId38"/>
+                    <a:srcRect b="0" l="0" r="0" t="0"/>
+                    <a:stretch>
+                      <a:fillRect/>
+                    </a:stretch>
+                  </pic:blipFill>
+                  <pic:spPr>
+                    <a:xfrm>
+                      <a:off x="0" y="0"/>
+                      <a:ext cx="5731200" cy="3225800"/>
+                    </a:xfrm>
+                    <a:prstGeom prst="rect"/>
+                    <a:ln/>
+                  </pic:spPr>
+                </pic:pic>
+              </a:graphicData>
+            </a:graphic>
+          </wp:inline>
+        </w:drawing>
+      </w:r>
+      <w:r>
+        <w:rPr>
+          <w:rtl w:val="0"/>
+        </w:rPr>
+      </w:r>
+    </w:p>
+    <w:p>
+      <w:pPr>
+        <w:rPr/>
+      </w:pPr>
+      <w:r>
+        <w:rPr>
+          <w:rtl w:val="0"/>
+        </w:rPr>
+      </w:r>
+    </w:p>
+    <w:p>
+      <w:pPr>
+        <w:rPr/>
+      </w:pPr>
+      <w:r>
+        <w:rPr/>
+        <w:drawing>
+          <wp:inline distB="114300" distT="114300" distL="114300" distR="114300">
+            <wp:extent cx="5731200" cy="3225800"/>
+            <wp:effectExtent b="0" l="0" r="0" t="0"/>
+            <wp:docPr id="4" name="image2.png"/>
+            <a:graphic>
+              <a:graphicData uri="http://schemas.openxmlformats.org/drawingml/2006/picture">
+                <pic:pic>
+                  <pic:nvPicPr>
+                    <pic:cNvPr id="0" name="image2.png"/>
+                    <pic:cNvPicPr preferRelativeResize="0"/>
+                  </pic:nvPicPr>
+                  <pic:blipFill>
+                    <a:blip r:embed="rId39"/>
+                    <a:srcRect b="0" l="0" r="0" t="0"/>
+                    <a:stretch>
+                      <a:fillRect/>
+                    </a:stretch>
+                  </pic:blipFill>
+                  <pic:spPr>
+                    <a:xfrm>
+                      <a:off x="0" y="0"/>
+                      <a:ext cx="5731200" cy="3225800"/>
+                    </a:xfrm>
+                    <a:prstGeom prst="rect"/>
+                    <a:ln/>
+                  </pic:spPr>
+                </pic:pic>
+              </a:graphicData>
+            </a:graphic>
+          </wp:inline>
+        </w:drawing>
+      </w:r>
+      <w:r>
+        <w:rPr>
+          <w:rtl w:val="0"/>
+        </w:rPr>
+      </w:r>
+    </w:p>
+    <w:p>
+      <w:pPr>
+        <w:rPr/>
+      </w:pPr>
+      <w:r>
+        <w:rPr>
+          <w:rtl w:val="0"/>
+        </w:rPr>
+      </w:r>
+    </w:p>
+    <w:p>
+      <w:pPr>
+        <w:rPr/>
+      </w:pPr>
+      <w:r>
+        <w:rPr/>
+        <w:drawing>
+          <wp:inline distB="114300" distT="114300" distL="114300" distR="114300">
+            <wp:extent cx="5731200" cy="3225800"/>
+            <wp:effectExtent b="0" l="0" r="0" t="0"/>
+            <wp:docPr id="22" name="image15.png"/>
+            <a:graphic>
+              <a:graphicData uri="http://schemas.openxmlformats.org/drawingml/2006/picture">
+                <pic:pic>
+                  <pic:nvPicPr>
+                    <pic:cNvPr id="0" name="image15.png"/>
+                    <pic:cNvPicPr preferRelativeResize="0"/>
+                  </pic:nvPicPr>
+                  <pic:blipFill>
+                    <a:blip r:embed="rId40"/>
+                    <a:srcRect b="0" l="0" r="0" t="0"/>
+                    <a:stretch>
+                      <a:fillRect/>
+                    </a:stretch>
+                  </pic:blipFill>
+                  <pic:spPr>
+                    <a:xfrm>
+                      <a:off x="0" y="0"/>
+                      <a:ext cx="5731200" cy="3225800"/>
+                    </a:xfrm>
+                    <a:prstGeom prst="rect"/>
+                    <a:ln/>
+                  </pic:spPr>
+                </pic:pic>
+              </a:graphicData>
+            </a:graphic>
+          </wp:inline>
+        </w:drawing>
+      </w:r>
+      <w:r>
+        <w:rPr>
+          <w:rtl w:val="0"/>
+        </w:rPr>
+      </w:r>
+    </w:p>
+    <w:p>
+      <w:pPr>
+        <w:rPr/>
+      </w:pPr>
+      <w:r>
+        <w:rPr>
+          <w:rtl w:val="0"/>
+        </w:rPr>
+      </w:r>
+    </w:p>
+    <w:p>
+      <w:pPr>
+        <w:rPr/>
+      </w:pPr>
+      <w:r>
+        <w:rPr>
+          <w:rtl w:val="0"/>
+        </w:rPr>
+        <w:t xml:space="preserve">Bài 2: Tạo Dockerfile chạy một ứng dụng Python Flask</w:t>
+      </w:r>
+    </w:p>
+    <w:p>
+      <w:pPr>
+        <w:rPr/>
+      </w:pPr>
+      <w:r>
+        <w:rPr>
+          <w:rtl w:val="0"/>
+        </w:rPr>
+        <w:t xml:space="preserve">Yêu cầu:Viết Dockerfile để chạy một ứng dụng Flask hiển thị "Hello, Docker Flask!" trên cổng 5000.</w:t>
+      </w:r>
+    </w:p>
+    <w:p>
+      <w:pPr>
+        <w:rPr/>
+      </w:pPr>
+      <w:r>
+        <w:rPr>
+          <w:rtl w:val="0"/>
+        </w:rPr>
+        <w:t xml:space="preserve">Sử dụng python:3.9 làm base image.</w:t>
+      </w:r>
+    </w:p>
+    <w:p>
+      <w:pPr>
+        <w:rPr/>
+      </w:pPr>
+      <w:r>
+        <w:rPr>
+          <w:rtl w:val="0"/>
+        </w:rPr>
+      </w:r>
+    </w:p>
+    <w:p>
+      <w:pPr>
+        <w:rPr/>
+      </w:pPr>
+      <w:r>
+        <w:rPr/>
+        <w:drawing>
+          <wp:inline distB="114300" distT="114300" distL="114300" distR="114300">
+            <wp:extent cx="5731200" cy="3225800"/>
+            <wp:effectExtent b="0" l="0" r="0" t="0"/>
+            <wp:docPr id="25" name="image16.png"/>
+            <a:graphic>
+              <a:graphicData uri="http://schemas.openxmlformats.org/drawingml/2006/picture">
+                <pic:pic>
+                  <pic:nvPicPr>
+                    <pic:cNvPr id="0" name="image16.png"/>
+                    <pic:cNvPicPr preferRelativeResize="0"/>
+                  </pic:nvPicPr>
+                  <pic:blipFill>
+                    <a:blip r:embed="rId41"/>
+                    <a:srcRect b="0" l="0" r="0" t="0"/>
+                    <a:stretch>
+                      <a:fillRect/>
+                    </a:stretch>
+                  </pic:blipFill>
+                  <pic:spPr>
+                    <a:xfrm>
+                      <a:off x="0" y="0"/>
+                      <a:ext cx="5731200" cy="3225800"/>
+                    </a:xfrm>
+                    <a:prstGeom prst="rect"/>
+                    <a:ln/>
+                  </pic:spPr>
+                </pic:pic>
+              </a:graphicData>
+            </a:graphic>
+          </wp:inline>
+        </w:drawing>
+      </w:r>
+      <w:r>
+        <w:rPr>
+          <w:rtl w:val="0"/>
+        </w:rPr>
+      </w:r>
+    </w:p>
+    <w:p>
+      <w:pPr>
+        <w:rPr/>
+      </w:pPr>
+      <w:r>
+        <w:rPr>
+          <w:rtl w:val="0"/>
+        </w:rPr>
+      </w:r>
+    </w:p>
+    <w:p>
+      <w:pPr>
+        <w:rPr/>
+      </w:pPr>
+      <w:r>
+        <w:rPr/>
+        <w:drawing>
+          <wp:inline distB="114300" distT="114300" distL="114300" distR="114300">
+            <wp:extent cx="5731200" cy="3225800"/>
+            <wp:effectExtent b="0" l="0" r="0" t="0"/>
+            <wp:docPr id="5" name="image11.png"/>
+            <a:graphic>
+              <a:graphicData uri="http://schemas.openxmlformats.org/drawingml/2006/picture">
+                <pic:pic>
+                  <pic:nvPicPr>
+                    <pic:cNvPr id="0" name="image11.png"/>
+                    <pic:cNvPicPr preferRelativeResize="0"/>
+                  </pic:nvPicPr>
+                  <pic:blipFill>
+                    <a:blip r:embed="rId42"/>
+                    <a:srcRect b="0" l="0" r="0" t="0"/>
+                    <a:stretch>
+                      <a:fillRect/>
+                    </a:stretch>
+                  </pic:blipFill>
+                  <pic:spPr>
+                    <a:xfrm>
+                      <a:off x="0" y="0"/>
+                      <a:ext cx="5731200" cy="3225800"/>
+                    </a:xfrm>
+                    <a:prstGeom prst="rect"/>
+                    <a:ln/>
+                  </pic:spPr>
+                </pic:pic>
+              </a:graphicData>
+            </a:graphic>
+          </wp:inline>
+        </w:drawing>
+      </w:r>
+      <w:r>
+        <w:rPr>
+          <w:rtl w:val="0"/>
+        </w:rPr>
+      </w:r>
+    </w:p>
+    <w:p>
+      <w:pPr>
+        <w:rPr/>
+      </w:pPr>
+      <w:r>
+        <w:rPr>
+          <w:rtl w:val="0"/>
+        </w:rPr>
+      </w:r>
+    </w:p>
+    <w:p>
+      <w:pPr>
+        <w:rPr/>
+      </w:pPr>
+      <w:r>
+        <w:rPr/>
+        <w:drawing>
+          <wp:inline distB="114300" distT="114300" distL="114300" distR="114300">
+            <wp:extent cx="5731200" cy="3225800"/>
+            <wp:effectExtent b="0" l="0" r="0" t="0"/>
+            <wp:docPr id="16" name="image7.png"/>
+            <a:graphic>
+              <a:graphicData uri="http://schemas.openxmlformats.org/drawingml/2006/picture">
+                <pic:pic>
+                  <pic:nvPicPr>
+                    <pic:cNvPr id="0" name="image7.png"/>
+                    <pic:cNvPicPr preferRelativeResize="0"/>
+                  </pic:nvPicPr>
+                  <pic:blipFill>
+                    <a:blip r:embed="rId43"/>
+                    <a:srcRect b="0" l="0" r="0" t="0"/>
+                    <a:stretch>
+                      <a:fillRect/>
+                    </a:stretch>
+                  </pic:blipFill>
+                  <pic:spPr>
+                    <a:xfrm>
+                      <a:off x="0" y="0"/>
+                      <a:ext cx="5731200" cy="3225800"/>
+                    </a:xfrm>
+                    <a:prstGeom prst="rect"/>
+                    <a:ln/>
+                  </pic:spPr>
+                </pic:pic>
+              </a:graphicData>
+            </a:graphic>
+          </wp:inline>
+        </w:drawing>
+      </w:r>
+      <w:r>
+        <w:rPr>
+          <w:rtl w:val="0"/>
+        </w:rPr>
+      </w:r>
+    </w:p>
+    <w:p>
+      <w:pPr>
+        <w:rPr/>
+      </w:pPr>
+      <w:r>
+        <w:rPr>
+          <w:rtl w:val="0"/>
+        </w:rPr>
+      </w:r>
+    </w:p>
+    <w:p>
+      <w:pPr>
+        <w:rPr/>
+      </w:pPr>
+      <w:r>
+        <w:rPr>
+          <w:rtl w:val="0"/>
+        </w:rPr>
+        <w:t xml:space="preserve">Bài 3: Tạo Dockerfile chạy một ứng dụng React</w:t>
+      </w:r>
+    </w:p>
+    <w:p>
+      <w:pPr>
+        <w:rPr/>
+      </w:pPr>
+      <w:r>
+        <w:rPr>
+          <w:rtl w:val="0"/>
+        </w:rPr>
+        <w:t xml:space="preserve">Yêu cầu:Viết Dockerfile để build và chạy một ứng dụng React.Sử dụng node:18-alpine làm base image.</w:t>
+      </w:r>
+    </w:p>
+    <w:p>
+      <w:pPr>
+        <w:rPr/>
+      </w:pPr>
+      <w:r>
+        <w:rPr>
+          <w:rtl w:val="0"/>
+        </w:rPr>
+      </w:r>
+    </w:p>
+    <w:p>
+      <w:pPr>
+        <w:rPr/>
+      </w:pPr>
+      <w:r>
+        <w:rPr>
+          <w:rtl w:val="0"/>
+        </w:rPr>
+      </w:r>
+    </w:p>
+    <w:p>
+      <w:pPr>
+        <w:rPr/>
+      </w:pPr>
+      <w:r>
+        <w:rPr>
+          <w:rtl w:val="0"/>
+        </w:rPr>
+      </w:r>
+    </w:p>
+    <w:p>
+      <w:pPr>
+        <w:rPr/>
+      </w:pPr>
+      <w:r>
+        <w:rPr>
+          <w:rtl w:val="0"/>
+        </w:rPr>
+        <w:t xml:space="preserve">Bài 4: Tạo Dockerfile chạy một trang web tĩnh bằng Nginx</w:t>
+      </w:r>
+    </w:p>
+    <w:p>
+      <w:pPr>
+        <w:rPr/>
+      </w:pPr>
+      <w:r>
+        <w:rPr>
+          <w:rtl w:val="0"/>
+        </w:rPr>
+        <w:t xml:space="preserve">Yêu cầu:Tạo một file index.html đơn giản và sử dụng nginx:latest để phục vụ trang web.</w:t>
+      </w:r>
+    </w:p>
+    <w:p>
+      <w:pPr>
+        <w:rPr/>
+      </w:pPr>
+      <w:r>
+        <w:rPr>
+          <w:rtl w:val="0"/>
+        </w:rPr>
+      </w:r>
+    </w:p>
+    <w:p>
+      <w:pPr>
+        <w:rPr/>
+      </w:pPr>
+      <w:r>
+        <w:rPr>
+          <w:rtl w:val="0"/>
+        </w:rPr>
+        <w:t xml:space="preserve">Bài 5: Tạo Dockerfile cho ứng dụng Go</w:t>
+      </w:r>
+    </w:p>
+    <w:p>
+      <w:pPr>
+        <w:rPr/>
+      </w:pPr>
+      <w:r>
+        <w:rPr>
+          <w:rtl w:val="0"/>
+        </w:rPr>
+        <w:t xml:space="preserve">Yêu cầu:Viết Dockerfile để build và chạy một ứng dụng Go đơn giản.</w:t>
+      </w:r>
+    </w:p>
+    <w:p>
+      <w:pPr>
+        <w:rPr/>
+      </w:pPr>
+      <w:r>
+        <w:rPr>
+          <w:rtl w:val="0"/>
+        </w:rPr>
+      </w:r>
+    </w:p>
+    <w:p>
+      <w:pPr>
+        <w:rPr/>
+      </w:pPr>
+      <w:r>
+        <w:rPr>
+          <w:rtl w:val="0"/>
+        </w:rPr>
+        <w:t xml:space="preserve">Bài 6: Sử dụng Multi-stage Build trong Dockerfile</w:t>
+      </w:r>
+    </w:p>
+    <w:p>
+      <w:pPr>
+        <w:rPr/>
+      </w:pPr>
+      <w:r>
+        <w:rPr>
+          <w:rtl w:val="0"/>
+        </w:rPr>
+        <w:t xml:space="preserve">Viết Dockerfile để build một ứng dụng Node.js với hai stage:Stage 1: Dùng node:18 để build code.Stage 2: Dùng node:18-alpine để chạy ứng dụng đã build.</w:t>
+      </w:r>
+    </w:p>
+    <w:p>
+      <w:pPr>
+        <w:rPr/>
+      </w:pPr>
+      <w:r>
+        <w:rPr>
+          <w:rtl w:val="0"/>
+        </w:rPr>
+      </w:r>
+    </w:p>
+    <w:p>
+      <w:pPr>
+        <w:rPr/>
+      </w:pPr>
+      <w:r>
+        <w:rPr>
+          <w:rtl w:val="0"/>
+        </w:rPr>
+        <w:t xml:space="preserve">Bài 7: Sử dụng biến môi trường trong Dockerfile</w:t>
+      </w:r>
+    </w:p>
+    <w:p>
+      <w:pPr>
+        <w:rPr/>
+      </w:pPr>
+      <w:r>
+        <w:rPr>
+          <w:rtl w:val="0"/>
+        </w:rPr>
+        <w:t xml:space="preserve">Yêu cầu:Viết Dockerfile cho ứng dụng Python đọc biến môi trường APP_ENV và in ra màn hình.</w:t>
+      </w:r>
+    </w:p>
+    <w:p>
+      <w:pPr>
+        <w:rPr/>
+      </w:pPr>
+      <w:r>
+        <w:rPr>
+          <w:rtl w:val="0"/>
+        </w:rPr>
+        <w:t xml:space="preserve">Sử dụng ENV APP_ENV=development trong Dockerfile.</w:t>
+      </w:r>
+    </w:p>
+    <w:p>
+      <w:pPr>
+        <w:rPr/>
+      </w:pPr>
+      <w:r>
+        <w:rPr>
+          <w:rtl w:val="0"/>
+        </w:rPr>
+      </w:r>
+    </w:p>
+    <w:p>
+      <w:pPr>
+        <w:rPr/>
+      </w:pPr>
+      <w:r>
+        <w:rPr>
+          <w:rtl w:val="0"/>
+        </w:rPr>
+        <w:t xml:space="preserve">Bài 8: Tạo Dockerfile cho PostgreSQL tùy chỉnh</w:t>
+      </w:r>
+    </w:p>
+    <w:p>
+      <w:pPr>
+        <w:rPr/>
+      </w:pPr>
+      <w:r>
+        <w:rPr>
+          <w:rtl w:val="0"/>
+        </w:rPr>
+        <w:t xml:space="preserve">Yêu cầu:Viết Dockerfile để chạy PostgreSQL (postgres:15).Thêm file SQL để tự động tạo database khi container chạy lần đầu tiên.</w:t>
+      </w:r>
+    </w:p>
+    <w:p>
+      <w:pPr>
+        <w:rPr/>
+      </w:pPr>
+      <w:r>
+        <w:rPr>
+          <w:rtl w:val="0"/>
+        </w:rPr>
+      </w:r>
+    </w:p>
+    <w:p>
+      <w:pPr>
+        <w:rPr/>
+      </w:pPr>
+      <w:r>
+        <w:rPr>
+          <w:rtl w:val="0"/>
+        </w:rPr>
+        <w:t xml:space="preserve">Bài 9: Tạo Dockerfile chạy Redis với cấu hình tùy chỉnh</w:t>
+      </w:r>
+    </w:p>
+    <w:p>
+      <w:pPr>
+        <w:rPr/>
+      </w:pPr>
+      <w:r>
+        <w:rPr>
+          <w:rtl w:val="0"/>
+        </w:rPr>
+        <w:t xml:space="preserve">Yêu cầu:Viết Dockerfile sử dụng redis:latest.Thêm file redis.conf vào container.Bài 10: Chạy ứng dụng PHP với Apache</w:t>
+      </w:r>
+    </w:p>
+    <w:p>
+      <w:pPr>
+        <w:rPr/>
+      </w:pPr>
+      <w:r>
+        <w:rPr>
+          <w:rtl w:val="0"/>
+        </w:rPr>
+        <w:t xml:space="preserve">Yêu cầu:Viết Dockerfile để chạy một ứng dụng PHP đơn giản (php:8.2-apache).Mount mã nguồn từ máy host vào container.</w:t>
+      </w:r>
+    </w:p>
     <w:p>
       <w:pPr>
         <w:rPr/>

</xml_diff>